<commit_message>
task 4 done today, 3 forgot to commit
</commit_message>
<xml_diff>
--- a/Task1/i23-0502_C_task1/i23-0502_C_task-report.docx
+++ b/Task1/i23-0502_C_task1/i23-0502_C_task-report.docx
@@ -7,10 +7,7 @@
         <w:pStyle w:val="Heading1"/>
       </w:pPr>
       <w:r>
-        <w:t>Car</w:t>
-      </w:r>
-      <w:r>
-        <w:t xml:space="preserve"> Gallery Website Project – AI vs Manual Analysis</w:t>
+        <w:t>Car Gallery Website Project – AI vs Manual Analysis</w:t>
       </w:r>
     </w:p>
     <w:p>
@@ -26,10 +23,7 @@
         <w:pStyle w:val="Heading2"/>
       </w:pPr>
       <w:r>
-        <w:t>1</w:t>
-      </w:r>
-      <w:r>
-        <w:t>. Manual Website Description</w:t>
+        <w:t>1. Manual Website Description</w:t>
       </w:r>
     </w:p>
     <w:p>
@@ -42,10 +36,7 @@
         <w:pStyle w:val="Heading2"/>
       </w:pPr>
       <w:r>
-        <w:t>2</w:t>
-      </w:r>
-      <w:r>
-        <w:t>. AI-Generated Website Description</w:t>
+        <w:t>2. AI-Generated Website Description</w:t>
       </w:r>
     </w:p>
     <w:p>
@@ -58,10 +49,7 @@
         <w:pStyle w:val="Heading2"/>
       </w:pPr>
       <w:r>
-        <w:t>3</w:t>
-      </w:r>
-      <w:r>
-        <w:t>. AI Prompts Used</w:t>
+        <w:t>3. AI Prompts Used</w:t>
       </w:r>
     </w:p>
     <w:p>
@@ -81,19 +69,21 @@
         <w:t>“make</w:t>
       </w:r>
       <w:r>
-        <w:t xml:space="preserve"> a premium car gallery website using HTML</w:t>
-      </w:r>
-      <w:r>
-        <w:t xml:space="preserve"> </w:t>
-      </w:r>
-      <w:r>
-        <w:t>with sections for login, signup, gallery, about, and feedback</w:t>
+        <w:t xml:space="preserve"> a premium car gallery website using HTML with sections for login, signup, gallery, about, and feedback</w:t>
       </w:r>
       <w:r>
         <w:t xml:space="preserve"> u can go all out make the most heaviest and impressive website u can make, use </w:t>
       </w:r>
       <w:r>
-        <w:t>images from mclaren,</w:t>
+        <w:t xml:space="preserve">images from </w:t>
+      </w:r>
+      <w:proofErr w:type="spellStart"/>
+      <w:r>
+        <w:t>mclaren</w:t>
+      </w:r>
+      <w:proofErr w:type="spellEnd"/>
+      <w:r>
+        <w:t>,</w:t>
       </w:r>
       <w:r>
         <w:t xml:space="preserve"> </w:t>
@@ -102,7 +92,15 @@
         <w:t>mustang,</w:t>
       </w:r>
       <w:r>
-        <w:t xml:space="preserve"> lambo and Bentley, all .jpg, make the website amazing”</w:t>
+        <w:t xml:space="preserve"> </w:t>
+      </w:r>
+      <w:proofErr w:type="spellStart"/>
+      <w:r>
+        <w:t>lambo</w:t>
+      </w:r>
+      <w:proofErr w:type="spellEnd"/>
+      <w:r>
+        <w:t xml:space="preserve"> and Bentley, all .jpg, make the website amazing”</w:t>
       </w:r>
       <w:r>
         <w:t xml:space="preserve"> </w:t>
@@ -112,8 +110,6 @@
       </w:r>
       <w:r>
         <w:br/>
-      </w:r>
-      <w:r>
         <w:t>Prompt</w:t>
       </w:r>
       <w:r>
@@ -126,10 +122,26 @@
         <w:br/>
       </w:r>
       <w:r>
-        <w:t xml:space="preserve">“Separate the css part from  the html one and </w:t>
+        <w:t xml:space="preserve">“Separate the </w:t>
+      </w:r>
+      <w:proofErr w:type="spellStart"/>
+      <w:r>
+        <w:t>css</w:t>
+      </w:r>
+      <w:proofErr w:type="spellEnd"/>
+      <w:r>
+        <w:t xml:space="preserve"> part from  the html one and </w:t>
       </w:r>
       <w:r>
-        <w:t xml:space="preserve">give me both of them separately, css should be out of this world and it should be responsive” </w:t>
+        <w:t xml:space="preserve">give me both of them separately, </w:t>
+      </w:r>
+      <w:proofErr w:type="spellStart"/>
+      <w:r>
+        <w:t>css</w:t>
+      </w:r>
+      <w:proofErr w:type="spellEnd"/>
+      <w:r>
+        <w:t xml:space="preserve"> should be out of this world and it should be responsive” </w:t>
       </w:r>
       <w:r>
         <w:t xml:space="preserve"> </w:t>
@@ -140,10 +152,7 @@
         <w:pStyle w:val="Heading2"/>
       </w:pPr>
       <w:r>
-        <w:t>4</w:t>
-      </w:r>
-      <w:r>
-        <w:t>. Comparison: Manual vs AI Website</w:t>
+        <w:t>4. Comparison: Manual vs AI Website</w:t>
       </w:r>
     </w:p>
     <w:p>
@@ -190,10 +199,7 @@
         <w:pStyle w:val="Heading2"/>
       </w:pPr>
       <w:r>
-        <w:t>5</w:t>
-      </w:r>
-      <w:r>
-        <w:t>. Learning Outcomes</w:t>
+        <w:t>5. Learning Outcomes</w:t>
       </w:r>
     </w:p>
     <w:p>
@@ -210,14 +216,14 @@
       </w:pPr>
       <w:r>
         <w:lastRenderedPageBreak/>
-        <w:t>6</w:t>
-      </w:r>
-      <w:r>
-        <w:t>. Git Submission Details</w:t>
+        <w:t>6. Git Submission Details</w:t>
       </w:r>
     </w:p>
     <w:p>
       <w:r>
+        <w:rPr>
+          <w:noProof/>
+        </w:rPr>
         <w:drawing>
           <wp:inline distT="0" distB="0" distL="0" distR="0" wp14:anchorId="46FDA484" wp14:editId="1E72E5B1">
             <wp:extent cx="5486400" cy="2808605"/>
@@ -263,10 +269,7 @@
         <w:pStyle w:val="Heading2"/>
       </w:pPr>
       <w:r>
-        <w:t>7</w:t>
-      </w:r>
-      <w:r>
-        <w:t>. Conclusion</w:t>
+        <w:t>7. Conclusion</w:t>
       </w:r>
     </w:p>
     <w:p>

</xml_diff>